<commit_message>
Explicitly set CBSE board on Certificate and report documents
</commit_message>
<xml_diff>
--- a/Certificate_and_Acknowledgement.docx
+++ b/Certificate_and_Acknowledgement.docx
@@ -93,7 +93,7 @@
           <w:color w:val="000000"/>
           <w:sz w:val="24"/>
         </w:rPr>
-        <w:t>as a part of A.I.S.S.C.E 20_____ under the guidance of his/her ________________ teacher.</w:t>
+        <w:t>as a part of CBSE 20_____ under the guidance of his/her ________________ teacher.</w:t>
       </w:r>
     </w:p>
     <w:p>
@@ -666,31 +666,31 @@
       </w:rPr>
     </w:lvl>
   </w:abstractNum>
-  <w:num w:numId="1" w16cid:durableId="1218735686">
+  <w:num w:numId="1" w16cid:durableId="1146631504">
     <w:abstractNumId w:val="8"/>
   </w:num>
-  <w:num w:numId="2" w16cid:durableId="1485390740">
+  <w:num w:numId="2" w16cid:durableId="977030695">
     <w:abstractNumId w:val="6"/>
   </w:num>
-  <w:num w:numId="3" w16cid:durableId="761335678">
+  <w:num w:numId="3" w16cid:durableId="357659366">
     <w:abstractNumId w:val="5"/>
   </w:num>
-  <w:num w:numId="4" w16cid:durableId="662856159">
+  <w:num w:numId="4" w16cid:durableId="990401049">
     <w:abstractNumId w:val="4"/>
   </w:num>
-  <w:num w:numId="5" w16cid:durableId="446504577">
+  <w:num w:numId="5" w16cid:durableId="1525442308">
     <w:abstractNumId w:val="7"/>
   </w:num>
-  <w:num w:numId="6" w16cid:durableId="400759475">
+  <w:num w:numId="6" w16cid:durableId="1442189782">
     <w:abstractNumId w:val="3"/>
   </w:num>
-  <w:num w:numId="7" w16cid:durableId="1694527696">
+  <w:num w:numId="7" w16cid:durableId="1761293786">
     <w:abstractNumId w:val="2"/>
   </w:num>
-  <w:num w:numId="8" w16cid:durableId="2128116301">
+  <w:num w:numId="8" w16cid:durableId="708192091">
     <w:abstractNumId w:val="1"/>
   </w:num>
-  <w:num w:numId="9" w16cid:durableId="1782649962">
+  <w:num w:numId="9" w16cid:durableId="1216939067">
     <w:abstractNumId w:val="0"/>
   </w:num>
 </w:numbering>

</xml_diff>

<commit_message>
Restore original A.I.S.S.C.E exam reference on Certificate
</commit_message>
<xml_diff>
--- a/Certificate_and_Acknowledgement.docx
+++ b/Certificate_and_Acknowledgement.docx
@@ -93,7 +93,7 @@
           <w:color w:val="000000"/>
           <w:sz w:val="24"/>
         </w:rPr>
-        <w:t>as a part of CBSE 20_____ under the guidance of his/her ________________ teacher.</w:t>
+        <w:t>as a part of A.I.S.S.C.E 20_____ under the guidance of his/her ________________ teacher.</w:t>
       </w:r>
     </w:p>
     <w:p>
@@ -666,31 +666,31 @@
       </w:rPr>
     </w:lvl>
   </w:abstractNum>
-  <w:num w:numId="1" w16cid:durableId="1146631504">
+  <w:num w:numId="1" w16cid:durableId="1075739439">
     <w:abstractNumId w:val="8"/>
   </w:num>
-  <w:num w:numId="2" w16cid:durableId="977030695">
+  <w:num w:numId="2" w16cid:durableId="613170848">
     <w:abstractNumId w:val="6"/>
   </w:num>
-  <w:num w:numId="3" w16cid:durableId="357659366">
+  <w:num w:numId="3" w16cid:durableId="1513258841">
     <w:abstractNumId w:val="5"/>
   </w:num>
-  <w:num w:numId="4" w16cid:durableId="990401049">
+  <w:num w:numId="4" w16cid:durableId="1476681666">
     <w:abstractNumId w:val="4"/>
   </w:num>
-  <w:num w:numId="5" w16cid:durableId="1525442308">
+  <w:num w:numId="5" w16cid:durableId="62682878">
     <w:abstractNumId w:val="7"/>
   </w:num>
-  <w:num w:numId="6" w16cid:durableId="1442189782">
+  <w:num w:numId="6" w16cid:durableId="1866358848">
     <w:abstractNumId w:val="3"/>
   </w:num>
-  <w:num w:numId="7" w16cid:durableId="1761293786">
+  <w:num w:numId="7" w16cid:durableId="931164925">
     <w:abstractNumId w:val="2"/>
   </w:num>
-  <w:num w:numId="8" w16cid:durableId="708192091">
+  <w:num w:numId="8" w16cid:durableId="767388371">
     <w:abstractNumId w:val="1"/>
   </w:num>
-  <w:num w:numId="9" w16cid:durableId="1216939067">
+  <w:num w:numId="9" w16cid:durableId="256061599">
     <w:abstractNumId w:val="0"/>
   </w:num>
 </w:numbering>

</xml_diff>